<commit_message>
Update whitepaper reference docx and PDF settings
</commit_message>
<xml_diff>
--- a/whitepaper-ref.docx
+++ b/whitepaper-ref.docx
@@ -148,7 +148,7 @@
       <w:rFonts w:ascii="Calibri" w:hAnsi="Calibri" w:eastAsia="" w:cs="" w:asciiTheme="majorHAnsi" w:cstheme="majorBidi" w:eastAsiaTheme="majorEastAsia" w:hAnsiTheme="majorHAnsi"/>
       <w:bCs/>
       <w:i/>
-      <w:color w:themeColor="accent1" w:val="4F81BD"/>
+      <w:color w:val="auto"/>
       <w:sz w:val="24"/>
       <w:szCs w:val="24"/>
     </w:rPr>
@@ -169,7 +169,7 @@
     <w:rPr>
       <w:rFonts w:ascii="Calibri" w:hAnsi="Calibri" w:eastAsia="" w:cs="" w:asciiTheme="majorHAnsi" w:cstheme="majorBidi" w:eastAsiaTheme="majorEastAsia" w:hAnsiTheme="majorHAnsi"/>
       <w:iCs/>
-      <w:color w:themeColor="accent1" w:val="4F81BD"/>
+      <w:color w:val="auto"/>
       <w:sz w:val="24"/>
       <w:szCs w:val="24"/>
     </w:rPr>
@@ -189,7 +189,7 @@
     </w:pPr>
     <w:rPr>
       <w:rFonts w:ascii="Calibri" w:hAnsi="Calibri" w:eastAsia="" w:cs="" w:asciiTheme="majorHAnsi" w:cstheme="majorBidi" w:eastAsiaTheme="majorEastAsia" w:hAnsiTheme="majorHAnsi"/>
-      <w:color w:themeColor="accent1" w:val="4F81BD"/>
+      <w:color w:val="auto"/>
       <w:sz w:val="24"/>
       <w:szCs w:val="24"/>
     </w:rPr>
@@ -921,7 +921,7 @@
         <w:bottom w:val="single" w:sz="2" w:space="7" w:color="000000"/>
         <w:right w:val="single" w:sz="2" w:space="7" w:color="000000"/>
       </w:pBdr>
-      <w:shd w:fill="EEEEEE" w:val="clear"/>
+      <w:shd w:val="clear" w:fill="EEEEEE"/>
       <w:suppressAutoHyphens w:val="true"/>
       <w:spacing w:lineRule="auto" w:line="300"/>
       <w:ind w:left="576" w:right="576"/>

</xml_diff>